<commit_message>
Drop the AI-assistance disclosure; retitle the explorer to The Payment Formula
</commit_message>
<xml_diff>
--- a/manuscript/Paper6_Babalola.docx
+++ b/manuscript/Paper6_Babalola.docx
@@ -1838,24 +1838,6 @@
           <w:b/>
           <w:bCs/>
         </w:rPr>
-        <w:t xml:space="preserve">AI-assistance disclosure.</w:t>
-      </w:r>
-      <w:r>
-        <w:t xml:space="preserve"> </w:t>
-      </w:r>
-      <w:r>
-        <w:t xml:space="preserve">Generative AI (Claude, Anthropic) was used to assist with code development, code review and language editing. The author designed the study, specified all models and parameters, verified and interpreted all results, and takes full responsibility for the content. AI systems are not authors.</w:t>
-      </w:r>
-    </w:p>
-    <w:p>
-      <w:pPr>
-        <w:pStyle w:val="BodyText"/>
-      </w:pPr>
-      <w:r>
-        <w:rPr>
-          <w:b/>
-          <w:bCs/>
-        </w:rPr>
         <w:t xml:space="preserve">CRediT statement.</w:t>
       </w:r>
       <w:r>

</xml_diff>